<commit_message>
Update exercise and docs file
</commit_message>
<xml_diff>
--- a/J1.S.P0056/J1.S.P0056.docx
+++ b/J1.S.P0056/J1.S.P0056.docx
@@ -1,6 +1,6 @@
 
 <file path=word/document.xml><?xml version="1.0" encoding="utf-8"?>
-<w:document xmlns:wpc="http://schemas.microsoft.com/office/word/2010/wordprocessingCanvas" xmlns:mc="http://schemas.openxmlformats.org/markup-compatibility/2006" xmlns:o="urn:schemas-microsoft-com:office:office" xmlns:r="http://schemas.openxmlformats.org/officeDocument/2006/relationships" xmlns:m="http://schemas.openxmlformats.org/officeDocument/2006/math" xmlns:v="urn:schemas-microsoft-com:vml" xmlns:wp14="http://schemas.microsoft.com/office/word/2010/wordprocessingDrawing" xmlns:wp="http://schemas.openxmlformats.org/drawingml/2006/wordprocessingDrawing" xmlns:w10="urn:schemas-microsoft-com:office:word" xmlns:w="http://schemas.openxmlformats.org/wordprocessingml/2006/main" xmlns:w14="http://schemas.microsoft.com/office/word/2010/wordml" xmlns:w15="http://schemas.microsoft.com/office/word/2012/wordml" xmlns:wpg="http://schemas.microsoft.com/office/word/2010/wordprocessingGroup" xmlns:wpi="http://schemas.microsoft.com/office/word/2010/wordprocessingInk" xmlns:wne="http://schemas.microsoft.com/office/word/2006/wordml" xmlns:wps="http://schemas.microsoft.com/office/word/2010/wordprocessingShape" mc:Ignorable="w14 w15 wp14">
+<w:document xmlns:wpc="http://schemas.microsoft.com/office/word/2010/wordprocessingCanvas" xmlns:cx="http://schemas.microsoft.com/office/drawing/2014/chartex" xmlns:cx1="http://schemas.microsoft.com/office/drawing/2015/9/8/chartex" xmlns:cx2="http://schemas.microsoft.com/office/drawing/2015/10/21/chartex" xmlns:cx3="http://schemas.microsoft.com/office/drawing/2016/5/9/chartex" xmlns:cx4="http://schemas.microsoft.com/office/drawing/2016/5/10/chartex" xmlns:cx5="http://schemas.microsoft.com/office/drawing/2016/5/11/chartex" xmlns:cx6="http://schemas.microsoft.com/office/drawing/2016/5/12/chartex" xmlns:cx7="http://schemas.microsoft.com/office/drawing/2016/5/13/chartex" xmlns:cx8="http://schemas.microsoft.com/office/drawing/2016/5/14/chartex" xmlns:mc="http://schemas.openxmlformats.org/markup-compatibility/2006" xmlns:aink="http://schemas.microsoft.com/office/drawing/2016/ink" xmlns:am3d="http://schemas.microsoft.com/office/drawing/2017/model3d" xmlns:o="urn:schemas-microsoft-com:office:office" xmlns:oel="http://schemas.microsoft.com/office/2019/extlst" xmlns:r="http://schemas.openxmlformats.org/officeDocument/2006/relationships" xmlns:m="http://schemas.openxmlformats.org/officeDocument/2006/math" xmlns:v="urn:schemas-microsoft-com:vml" xmlns:wp14="http://schemas.microsoft.com/office/word/2010/wordprocessingDrawing" xmlns:wp="http://schemas.openxmlformats.org/drawingml/2006/wordprocessingDrawing" xmlns:w10="urn:schemas-microsoft-com:office:word" xmlns:w="http://schemas.openxmlformats.org/wordprocessingml/2006/main" xmlns:w14="http://schemas.microsoft.com/office/word/2010/wordml" xmlns:w15="http://schemas.microsoft.com/office/word/2012/wordml" xmlns:w16cex="http://schemas.microsoft.com/office/word/2018/wordml/cex" xmlns:w16cid="http://schemas.microsoft.com/office/word/2016/wordml/cid" xmlns:w16="http://schemas.microsoft.com/office/word/2018/wordml" xmlns:w16sdtdh="http://schemas.microsoft.com/office/word/2020/wordml/sdtdatahash" xmlns:w16se="http://schemas.microsoft.com/office/word/2015/wordml/symex" xmlns:wpg="http://schemas.microsoft.com/office/word/2010/wordprocessingGroup" xmlns:wpi="http://schemas.microsoft.com/office/word/2010/wordprocessingInk" xmlns:wne="http://schemas.microsoft.com/office/word/2006/wordml" xmlns:wps="http://schemas.microsoft.com/office/word/2010/wordprocessingShape" mc:Ignorable="w14 w15 w16se w16cid w16 w16cex w16sdtdh wp14">
   <w:body>
     <w:tbl>
       <w:tblPr>
@@ -249,8 +249,6 @@
               </w:rPr>
               <w:fldChar w:fldCharType="end"/>
             </w:r>
-            <w:bookmarkStart w:id="0" w:name="_GoBack"/>
-            <w:bookmarkEnd w:id="0"/>
           </w:p>
         </w:tc>
       </w:tr>
@@ -306,7 +304,7 @@
                 <w:b/>
                 <w:color w:val="2F5496" w:themeColor="accent5" w:themeShade="BF"/>
               </w:rPr>
-              <w:t>70</w:t>
+              <w:t>120</w:t>
             </w:r>
           </w:p>
         </w:tc>
@@ -822,23 +820,21 @@
           <w:rFonts w:eastAsia="Times New Roman" w:cs="Arial"/>
           <w:lang w:eastAsia="ja-JP"/>
         </w:rPr>
-        <w:t xml:space="preserve">(id, </w:t>
-      </w:r>
-      <w:proofErr w:type="spellStart"/>
-      <w:r>
-        <w:rPr>
-          <w:rFonts w:eastAsia="Times New Roman" w:cs="Arial"/>
-          <w:lang w:eastAsia="ja-JP"/>
-        </w:rPr>
-        <w:t>name,age</w:t>
-      </w:r>
-      <w:proofErr w:type="spellEnd"/>
-      <w:r>
-        <w:rPr>
-          <w:rFonts w:eastAsia="Times New Roman" w:cs="Arial"/>
-          <w:lang w:eastAsia="ja-JP"/>
-        </w:rPr>
-        <w:t>, salary, work location)</w:t>
+        <w:t>(id, name,</w:t>
+      </w:r>
+      <w:r>
+        <w:rPr>
+          <w:rFonts w:eastAsia="Times New Roman" w:cs="Arial"/>
+          <w:lang w:eastAsia="ja-JP"/>
+        </w:rPr>
+        <w:t xml:space="preserve"> </w:t>
+      </w:r>
+      <w:r>
+        <w:rPr>
+          <w:rFonts w:eastAsia="Times New Roman" w:cs="Arial"/>
+          <w:lang w:eastAsia="ja-JP"/>
+        </w:rPr>
+        <w:t>age, salary, work location)</w:t>
       </w:r>
     </w:p>
     <w:p>
@@ -873,21 +869,12 @@
           <w:lang w:eastAsia="ja-JP"/>
         </w:rPr>
       </w:pPr>
-      <w:proofErr w:type="gramStart"/>
-      <w:r>
-        <w:rPr>
-          <w:rFonts w:eastAsia="Times New Roman" w:cs="Arial"/>
-          <w:lang w:eastAsia="ja-JP"/>
-        </w:rPr>
-        <w:t>Code(</w:t>
-      </w:r>
-      <w:proofErr w:type="gramEnd"/>
-      <w:r>
-        <w:rPr>
-          <w:rFonts w:eastAsia="Times New Roman" w:cs="Arial"/>
-          <w:lang w:eastAsia="ja-JP"/>
-        </w:rPr>
-        <w:t>id) cannot be null or duplicated with existed Code in DB.</w:t>
+      <w:r>
+        <w:rPr>
+          <w:rFonts w:eastAsia="Times New Roman" w:cs="Arial"/>
+          <w:lang w:eastAsia="ja-JP"/>
+        </w:rPr>
+        <w:t>Code(id) cannot be null or duplicated with existed Code in DB.</w:t>
       </w:r>
     </w:p>
     <w:p>
@@ -1090,21 +1077,12 @@
           <w:lang w:eastAsia="ja-JP"/>
         </w:rPr>
       </w:pPr>
-      <w:proofErr w:type="gramStart"/>
-      <w:r>
-        <w:rPr>
-          <w:rFonts w:eastAsia="Times New Roman" w:cs="Arial"/>
-          <w:lang w:eastAsia="ja-JP"/>
-        </w:rPr>
-        <w:t>Code(</w:t>
-      </w:r>
-      <w:proofErr w:type="gramEnd"/>
-      <w:r>
-        <w:rPr>
-          <w:rFonts w:eastAsia="Times New Roman" w:cs="Arial"/>
-          <w:lang w:eastAsia="ja-JP"/>
-        </w:rPr>
-        <w:t>id) must be existed in DB.</w:t>
+      <w:r>
+        <w:rPr>
+          <w:rFonts w:eastAsia="Times New Roman" w:cs="Arial"/>
+          <w:lang w:eastAsia="ja-JP"/>
+        </w:rPr>
+        <w:t>Code(id) must be existed in DB.</w:t>
       </w:r>
     </w:p>
     <w:p>
@@ -1212,21 +1190,12 @@
         </w:rPr>
         <w:t xml:space="preserve">Prompt user to input </w:t>
       </w:r>
-      <w:proofErr w:type="gramStart"/>
-      <w:r>
-        <w:rPr>
-          <w:rFonts w:eastAsia="Times New Roman" w:cs="Arial"/>
-          <w:lang w:eastAsia="ja-JP"/>
-        </w:rPr>
-        <w:t>Code(</w:t>
-      </w:r>
-      <w:proofErr w:type="gramEnd"/>
-      <w:r>
-        <w:rPr>
-          <w:rFonts w:eastAsia="Times New Roman" w:cs="Arial"/>
-          <w:lang w:eastAsia="ja-JP"/>
-        </w:rPr>
-        <w:t>id)</w:t>
+      <w:r>
+        <w:rPr>
+          <w:rFonts w:eastAsia="Times New Roman" w:cs="Arial"/>
+          <w:lang w:eastAsia="ja-JP"/>
+        </w:rPr>
+        <w:t>Code(id)</w:t>
       </w:r>
       <w:r>
         <w:rPr>
@@ -1275,21 +1244,12 @@
           <w:lang w:eastAsia="ja-JP"/>
         </w:rPr>
       </w:pPr>
-      <w:proofErr w:type="gramStart"/>
-      <w:r>
-        <w:rPr>
-          <w:rFonts w:eastAsia="Times New Roman" w:cs="Arial"/>
-          <w:lang w:eastAsia="ja-JP"/>
-        </w:rPr>
-        <w:t>Code(</w:t>
-      </w:r>
-      <w:proofErr w:type="gramEnd"/>
-      <w:r>
-        <w:rPr>
-          <w:rFonts w:eastAsia="Times New Roman" w:cs="Arial"/>
-          <w:lang w:eastAsia="ja-JP"/>
-        </w:rPr>
-        <w:t>id) must be existed in DB.</w:t>
+      <w:r>
+        <w:rPr>
+          <w:rFonts w:eastAsia="Times New Roman" w:cs="Arial"/>
+          <w:lang w:eastAsia="ja-JP"/>
+        </w:rPr>
+        <w:t>Code(id) must be existed in DB.</w:t>
       </w:r>
     </w:p>
     <w:p>
@@ -1324,21 +1284,12 @@
           <w:lang w:eastAsia="ja-JP"/>
         </w:rPr>
       </w:pPr>
-      <w:proofErr w:type="spellStart"/>
-      <w:r>
-        <w:rPr>
-          <w:rFonts w:eastAsia="Times New Roman" w:cs="Arial"/>
-          <w:lang w:eastAsia="ja-JP"/>
-        </w:rPr>
-        <w:t>Substract</w:t>
-      </w:r>
-      <w:proofErr w:type="spellEnd"/>
-      <w:r>
-        <w:rPr>
-          <w:rFonts w:eastAsia="Times New Roman" w:cs="Arial"/>
-          <w:lang w:eastAsia="ja-JP"/>
-        </w:rPr>
-        <w:t xml:space="preserve"> salary to worker and save salary history </w:t>
+      <w:r>
+        <w:rPr>
+          <w:rFonts w:eastAsia="Times New Roman" w:cs="Arial"/>
+          <w:lang w:eastAsia="ja-JP"/>
+        </w:rPr>
+        <w:t xml:space="preserve">Subtract salary to worker and save salary history </w:t>
       </w:r>
     </w:p>
     <w:p>
@@ -1373,21 +1324,12 @@
           <w:lang w:eastAsia="ja-JP"/>
         </w:rPr>
       </w:pPr>
-      <w:proofErr w:type="gramStart"/>
-      <w:r>
-        <w:rPr>
-          <w:rFonts w:eastAsia="Times New Roman" w:cs="Arial"/>
-          <w:lang w:eastAsia="ja-JP"/>
-        </w:rPr>
-        <w:t>Option  4</w:t>
-      </w:r>
-      <w:proofErr w:type="gramEnd"/>
-      <w:r>
-        <w:rPr>
-          <w:rFonts w:eastAsia="Times New Roman" w:cs="Arial"/>
-          <w:lang w:eastAsia="ja-JP"/>
-        </w:rPr>
-        <w:t>:</w:t>
+      <w:r>
+        <w:rPr>
+          <w:rFonts w:eastAsia="Times New Roman" w:cs="Arial"/>
+          <w:lang w:eastAsia="ja-JP"/>
+        </w:rPr>
+        <w:t>Option 4:</w:t>
       </w:r>
       <w:r>
         <w:rPr>
@@ -1416,21 +1358,12 @@
           <w:lang w:eastAsia="ja-JP"/>
         </w:rPr>
       </w:pPr>
-      <w:proofErr w:type="gramStart"/>
-      <w:r>
-        <w:rPr>
-          <w:rFonts w:eastAsia="Times New Roman" w:cs="Arial"/>
-          <w:lang w:eastAsia="ja-JP"/>
-        </w:rPr>
-        <w:t>Option  5</w:t>
-      </w:r>
-      <w:proofErr w:type="gramEnd"/>
-      <w:r>
-        <w:rPr>
-          <w:rFonts w:eastAsia="Times New Roman" w:cs="Arial"/>
-          <w:lang w:eastAsia="ja-JP"/>
-        </w:rPr>
-        <w:t>:</w:t>
+      <w:r>
+        <w:rPr>
+          <w:rFonts w:eastAsia="Times New Roman" w:cs="Arial"/>
+          <w:lang w:eastAsia="ja-JP"/>
+        </w:rPr>
+        <w:t>Option 5:</w:t>
       </w:r>
       <w:r>
         <w:t xml:space="preserve"> </w:t>
@@ -1497,7 +1430,7 @@
         <mc:AlternateContent>
           <mc:Choice Requires="wpg">
             <w:drawing>
-              <wp:inline distT="0" distB="0" distL="0" distR="0">
+              <wp:inline distT="0" distB="0" distL="0" distR="0" wp14:anchorId="78C44619" wp14:editId="1CC21A7B">
                 <wp:extent cx="6362700" cy="3825240"/>
                 <wp:effectExtent l="0" t="0" r="19050" b="22860"/>
                 <wp:docPr id="16" name="Group 16"/>
@@ -1881,20 +1814,8 @@
                                   <w:szCs w:val="20"/>
                                   <w:lang w:eastAsia="ja-JP"/>
                                 </w:rPr>
-                                <w:t>Enter Name</w:t>
+                                <w:t>Enter Name:</w:t>
                               </w:r>
-                              <w:proofErr w:type="gramStart"/>
-                              <w:r>
-                                <w:rPr>
-                                  <w:rFonts w:ascii="Consolas" w:hAnsi="Consolas" w:cs="Consolas"/>
-                                  <w:color w:val="000000"/>
-                                  <w:sz w:val="20"/>
-                                  <w:szCs w:val="20"/>
-                                  <w:lang w:eastAsia="ja-JP"/>
-                                </w:rPr>
-                                <w:t>:</w:t>
-                              </w:r>
-                              <w:proofErr w:type="gramEnd"/>
                               <w:r>
                                 <w:rPr>
                                   <w:rFonts w:ascii="Consolas" w:hAnsi="Consolas" w:cs="Consolas"/>
@@ -4323,21 +4244,7 @@
         <w:rPr>
           <w:rStyle w:val="Strong"/>
         </w:rPr>
-        <w:t xml:space="preserve"> </w:t>
-      </w:r>
-      <w:proofErr w:type="gramStart"/>
-      <w:r>
-        <w:rPr>
-          <w:rStyle w:val="Strong"/>
-        </w:rPr>
-        <w:t>in</w:t>
-      </w:r>
-      <w:proofErr w:type="gramEnd"/>
-      <w:r>
-        <w:rPr>
-          <w:rStyle w:val="Strong"/>
-        </w:rPr>
-        <w:t xml:space="preserve"> startup code.</w:t>
+        <w:t xml:space="preserve"> in startup code.</w:t>
       </w:r>
     </w:p>
     <w:p>
@@ -4392,7 +4299,6 @@
           <w:rFonts w:cs="Arial"/>
         </w:rPr>
       </w:pPr>
-      <w:proofErr w:type="gramStart"/>
       <w:r>
         <w:rPr>
           <w:rFonts w:eastAsia="Times New Roman" w:cs="Arial"/>
@@ -4420,22 +4326,14 @@
           <w:szCs w:val="24"/>
           <w:lang w:eastAsia="ja-JP"/>
         </w:rPr>
-        <w:t xml:space="preserve">  </w:t>
+        <w:t xml:space="preserve"> </w:t>
       </w:r>
       <w:r>
         <w:rPr>
           <w:rFonts w:cs="Arial"/>
           <w:b/>
         </w:rPr>
-        <w:t>1</w:t>
-      </w:r>
-      <w:proofErr w:type="gramEnd"/>
-      <w:r>
-        <w:rPr>
-          <w:rFonts w:cs="Arial"/>
-          <w:b/>
-        </w:rPr>
-        <w:t>:</w:t>
+        <w:t>1:</w:t>
       </w:r>
       <w:r>
         <w:rPr>
@@ -4543,19 +4441,11 @@
           <w:rFonts w:cs="Arial"/>
         </w:rPr>
       </w:pPr>
-      <w:proofErr w:type="gramStart"/>
-      <w:r>
-        <w:rPr>
-          <w:rFonts w:cs="Arial"/>
-        </w:rPr>
-        <w:t>worker</w:t>
-      </w:r>
-      <w:proofErr w:type="gramEnd"/>
-      <w:r>
-        <w:rPr>
-          <w:rFonts w:cs="Arial"/>
-        </w:rPr>
-        <w:t>: worker</w:t>
+      <w:r>
+        <w:rPr>
+          <w:rFonts w:cs="Arial"/>
+        </w:rPr>
+        <w:t>worker: worker</w:t>
       </w:r>
       <w:r>
         <w:rPr>
@@ -4654,7 +4544,6 @@
           <w:rFonts w:cs="Arial"/>
         </w:rPr>
       </w:pPr>
-      <w:proofErr w:type="gramStart"/>
       <w:r>
         <w:rPr>
           <w:rFonts w:eastAsia="Times New Roman" w:cs="Arial"/>
@@ -4682,7 +4571,7 @@
           <w:szCs w:val="24"/>
           <w:lang w:eastAsia="ja-JP"/>
         </w:rPr>
-        <w:t xml:space="preserve">  </w:t>
+        <w:t xml:space="preserve"> </w:t>
       </w:r>
       <w:r>
         <w:rPr>
@@ -4691,7 +4580,6 @@
         </w:rPr>
         <w:t>2</w:t>
       </w:r>
-      <w:proofErr w:type="gramEnd"/>
       <w:r>
         <w:rPr>
           <w:rFonts w:cs="Arial"/>
@@ -4726,7 +4614,7 @@
           <w:szCs w:val="24"/>
           <w:lang w:eastAsia="ja-JP"/>
         </w:rPr>
-        <w:t xml:space="preserve">  </w:t>
+        <w:t xml:space="preserve"> </w:t>
       </w:r>
       <w:r>
         <w:rPr>
@@ -4868,19 +4756,11 @@
           <w:rFonts w:cs="Arial"/>
         </w:rPr>
       </w:pPr>
-      <w:proofErr w:type="gramStart"/>
-      <w:r>
-        <w:rPr>
-          <w:rFonts w:cs="Arial"/>
-        </w:rPr>
-        <w:t>status</w:t>
-      </w:r>
-      <w:proofErr w:type="gramEnd"/>
-      <w:r>
-        <w:rPr>
-          <w:rFonts w:cs="Arial"/>
-        </w:rPr>
-        <w:t xml:space="preserve">: </w:t>
+      <w:r>
+        <w:rPr>
+          <w:rFonts w:cs="Arial"/>
+        </w:rPr>
+        <w:t xml:space="preserve">status: </w:t>
       </w:r>
       <w:r>
         <w:rPr>
@@ -5021,7 +4901,6 @@
           <w:rFonts w:cs="Arial"/>
         </w:rPr>
       </w:pPr>
-      <w:proofErr w:type="gramStart"/>
       <w:r>
         <w:rPr>
           <w:rFonts w:eastAsia="Times New Roman" w:cs="Arial"/>
@@ -5049,22 +4928,14 @@
           <w:szCs w:val="24"/>
           <w:lang w:eastAsia="ja-JP"/>
         </w:rPr>
-        <w:t xml:space="preserve">  </w:t>
+        <w:t xml:space="preserve"> </w:t>
       </w:r>
       <w:r>
         <w:rPr>
           <w:rFonts w:cs="Arial"/>
           <w:b/>
         </w:rPr>
-        <w:t>4</w:t>
-      </w:r>
-      <w:proofErr w:type="gramEnd"/>
-      <w:r>
-        <w:rPr>
-          <w:rFonts w:cs="Arial"/>
-          <w:b/>
-        </w:rPr>
-        <w:t>:</w:t>
+        <w:t>4:</w:t>
       </w:r>
       <w:r>
         <w:rPr>
@@ -5207,7 +5078,7 @@
 </file>
 
 <file path=word/numbering.xml><?xml version="1.0" encoding="utf-8"?>
-<w:numbering xmlns:wpc="http://schemas.microsoft.com/office/word/2010/wordprocessingCanvas" xmlns:mc="http://schemas.openxmlformats.org/markup-compatibility/2006" xmlns:o="urn:schemas-microsoft-com:office:office" xmlns:r="http://schemas.openxmlformats.org/officeDocument/2006/relationships" xmlns:m="http://schemas.openxmlformats.org/officeDocument/2006/math" xmlns:v="urn:schemas-microsoft-com:vml" xmlns:wp14="http://schemas.microsoft.com/office/word/2010/wordprocessingDrawing" xmlns:wp="http://schemas.openxmlformats.org/drawingml/2006/wordprocessingDrawing" xmlns:w10="urn:schemas-microsoft-com:office:word" xmlns:w="http://schemas.openxmlformats.org/wordprocessingml/2006/main" xmlns:w14="http://schemas.microsoft.com/office/word/2010/wordml" xmlns:w15="http://schemas.microsoft.com/office/word/2012/wordml" xmlns:wpg="http://schemas.microsoft.com/office/word/2010/wordprocessingGroup" xmlns:wpi="http://schemas.microsoft.com/office/word/2010/wordprocessingInk" xmlns:wne="http://schemas.microsoft.com/office/word/2006/wordml" xmlns:wps="http://schemas.microsoft.com/office/word/2010/wordprocessingShape" mc:Ignorable="w14 w15 wp14">
+<w:numbering xmlns:wpc="http://schemas.microsoft.com/office/word/2010/wordprocessingCanvas" xmlns:cx="http://schemas.microsoft.com/office/drawing/2014/chartex" xmlns:cx1="http://schemas.microsoft.com/office/drawing/2015/9/8/chartex" xmlns:cx2="http://schemas.microsoft.com/office/drawing/2015/10/21/chartex" xmlns:cx3="http://schemas.microsoft.com/office/drawing/2016/5/9/chartex" xmlns:cx4="http://schemas.microsoft.com/office/drawing/2016/5/10/chartex" xmlns:cx5="http://schemas.microsoft.com/office/drawing/2016/5/11/chartex" xmlns:cx6="http://schemas.microsoft.com/office/drawing/2016/5/12/chartex" xmlns:cx7="http://schemas.microsoft.com/office/drawing/2016/5/13/chartex" xmlns:cx8="http://schemas.microsoft.com/office/drawing/2016/5/14/chartex" xmlns:mc="http://schemas.openxmlformats.org/markup-compatibility/2006" xmlns:aink="http://schemas.microsoft.com/office/drawing/2016/ink" xmlns:am3d="http://schemas.microsoft.com/office/drawing/2017/model3d" xmlns:o="urn:schemas-microsoft-com:office:office" xmlns:oel="http://schemas.microsoft.com/office/2019/extlst" xmlns:r="http://schemas.openxmlformats.org/officeDocument/2006/relationships" xmlns:m="http://schemas.openxmlformats.org/officeDocument/2006/math" xmlns:v="urn:schemas-microsoft-com:vml" xmlns:wp14="http://schemas.microsoft.com/office/word/2010/wordprocessingDrawing" xmlns:wp="http://schemas.openxmlformats.org/drawingml/2006/wordprocessingDrawing" xmlns:w10="urn:schemas-microsoft-com:office:word" xmlns:w="http://schemas.openxmlformats.org/wordprocessingml/2006/main" xmlns:w14="http://schemas.microsoft.com/office/word/2010/wordml" xmlns:w15="http://schemas.microsoft.com/office/word/2012/wordml" xmlns:w16cex="http://schemas.microsoft.com/office/word/2018/wordml/cex" xmlns:w16cid="http://schemas.microsoft.com/office/word/2016/wordml/cid" xmlns:w16="http://schemas.microsoft.com/office/word/2018/wordml" xmlns:w16sdtdh="http://schemas.microsoft.com/office/word/2020/wordml/sdtdatahash" xmlns:w16se="http://schemas.microsoft.com/office/word/2015/wordml/symex" xmlns:wpg="http://schemas.microsoft.com/office/word/2010/wordprocessingGroup" xmlns:wpi="http://schemas.microsoft.com/office/word/2010/wordprocessingInk" xmlns:wne="http://schemas.microsoft.com/office/word/2006/wordml" xmlns:wps="http://schemas.microsoft.com/office/word/2010/wordprocessingShape" mc:Ignorable="w14 w15 w16se w16cid w16 w16cex w16sdtdh wp14">
   <w:abstractNum w:abstractNumId="0" w15:restartNumberingAfterBreak="0">
     <w:nsid w:val="01D62C1F"/>
     <w:multiLevelType w:val="hybridMultilevel"/>
@@ -6780,7 +6651,6 @@
     </w:lvl>
     <w:lvl w:ilvl="1" w:tplc="C3B44FC4">
       <w:numFmt w:val="bullet"/>
-      <w:pStyle w:val="ListParagraph"/>
       <w:lvlText w:val="-"/>
       <w:lvlJc w:val="left"/>
       <w:pPr>
@@ -7753,92 +7623,92 @@
       </w:rPr>
     </w:lvl>
   </w:abstractNum>
-  <w:num w:numId="1">
+  <w:num w:numId="1" w16cid:durableId="1847212881">
     <w:abstractNumId w:val="18"/>
   </w:num>
-  <w:num w:numId="2">
+  <w:num w:numId="2" w16cid:durableId="1215779787">
     <w:abstractNumId w:val="16"/>
   </w:num>
-  <w:num w:numId="3">
+  <w:num w:numId="3" w16cid:durableId="655039626">
     <w:abstractNumId w:val="4"/>
   </w:num>
-  <w:num w:numId="4">
+  <w:num w:numId="4" w16cid:durableId="558129840">
     <w:abstractNumId w:val="17"/>
   </w:num>
-  <w:num w:numId="5">
+  <w:num w:numId="5" w16cid:durableId="1349407169">
     <w:abstractNumId w:val="7"/>
   </w:num>
-  <w:num w:numId="6">
+  <w:num w:numId="6" w16cid:durableId="865412945">
     <w:abstractNumId w:val="3"/>
   </w:num>
-  <w:num w:numId="7">
+  <w:num w:numId="7" w16cid:durableId="520903066">
     <w:abstractNumId w:val="11"/>
   </w:num>
-  <w:num w:numId="8">
+  <w:num w:numId="8" w16cid:durableId="2059820392">
     <w:abstractNumId w:val="9"/>
   </w:num>
-  <w:num w:numId="9">
+  <w:num w:numId="9" w16cid:durableId="1049188830">
     <w:abstractNumId w:val="12"/>
   </w:num>
-  <w:num w:numId="10">
+  <w:num w:numId="10" w16cid:durableId="783576562">
     <w:abstractNumId w:val="20"/>
   </w:num>
-  <w:num w:numId="11">
+  <w:num w:numId="11" w16cid:durableId="526720106">
     <w:abstractNumId w:val="2"/>
   </w:num>
-  <w:num w:numId="12">
+  <w:num w:numId="12" w16cid:durableId="2139377015">
     <w:abstractNumId w:val="8"/>
   </w:num>
-  <w:num w:numId="13">
+  <w:num w:numId="13" w16cid:durableId="1392659084">
     <w:abstractNumId w:val="10"/>
   </w:num>
-  <w:num w:numId="14">
+  <w:num w:numId="14" w16cid:durableId="605044070">
     <w:abstractNumId w:val="1"/>
   </w:num>
-  <w:num w:numId="15">
+  <w:num w:numId="15" w16cid:durableId="1138493421">
     <w:abstractNumId w:val="19"/>
   </w:num>
-  <w:num w:numId="16">
+  <w:num w:numId="16" w16cid:durableId="1547765304">
     <w:abstractNumId w:val="13"/>
   </w:num>
-  <w:num w:numId="17">
+  <w:num w:numId="17" w16cid:durableId="455951468">
     <w:abstractNumId w:val="9"/>
   </w:num>
-  <w:num w:numId="18">
+  <w:num w:numId="18" w16cid:durableId="293218854">
     <w:abstractNumId w:val="12"/>
   </w:num>
-  <w:num w:numId="19">
+  <w:num w:numId="19" w16cid:durableId="1474328421">
     <w:abstractNumId w:val="20"/>
   </w:num>
-  <w:num w:numId="20">
+  <w:num w:numId="20" w16cid:durableId="1482429189">
     <w:abstractNumId w:val="10"/>
   </w:num>
-  <w:num w:numId="21">
+  <w:num w:numId="21" w16cid:durableId="2084058067">
     <w:abstractNumId w:val="0"/>
   </w:num>
-  <w:num w:numId="22">
+  <w:num w:numId="22" w16cid:durableId="1683699325">
     <w:abstractNumId w:val="21"/>
   </w:num>
-  <w:num w:numId="23">
+  <w:num w:numId="23" w16cid:durableId="2144299943">
     <w:abstractNumId w:val="15"/>
   </w:num>
-  <w:num w:numId="24">
+  <w:num w:numId="24" w16cid:durableId="1799713609">
     <w:abstractNumId w:val="22"/>
   </w:num>
-  <w:num w:numId="25">
+  <w:num w:numId="25" w16cid:durableId="133066020">
     <w:abstractNumId w:val="5"/>
   </w:num>
-  <w:num w:numId="26">
+  <w:num w:numId="26" w16cid:durableId="1800807301">
     <w:abstractNumId w:val="14"/>
   </w:num>
-  <w:num w:numId="27">
+  <w:num w:numId="27" w16cid:durableId="202718227">
     <w:abstractNumId w:val="6"/>
   </w:num>
 </w:numbering>
 </file>
 
 <file path=word/styles.xml><?xml version="1.0" encoding="utf-8"?>
-<w:styles xmlns:mc="http://schemas.openxmlformats.org/markup-compatibility/2006" xmlns:r="http://schemas.openxmlformats.org/officeDocument/2006/relationships" xmlns:w="http://schemas.openxmlformats.org/wordprocessingml/2006/main" xmlns:w14="http://schemas.microsoft.com/office/word/2010/wordml" xmlns:w15="http://schemas.microsoft.com/office/word/2012/wordml" mc:Ignorable="w14 w15">
+<w:styles xmlns:mc="http://schemas.openxmlformats.org/markup-compatibility/2006" xmlns:r="http://schemas.openxmlformats.org/officeDocument/2006/relationships" xmlns:w="http://schemas.openxmlformats.org/wordprocessingml/2006/main" xmlns:w14="http://schemas.microsoft.com/office/word/2010/wordml" xmlns:w15="http://schemas.microsoft.com/office/word/2012/wordml" xmlns:w16cex="http://schemas.microsoft.com/office/word/2018/wordml/cex" xmlns:w16cid="http://schemas.microsoft.com/office/word/2016/wordml/cid" xmlns:w16="http://schemas.microsoft.com/office/word/2018/wordml" xmlns:w16sdtdh="http://schemas.microsoft.com/office/word/2020/wordml/sdtdatahash" xmlns:w16se="http://schemas.microsoft.com/office/word/2015/wordml/symex" mc:Ignorable="w14 w15 w16se w16cid w16 w16cex w16sdtdh">
   <w:docDefaults>
     <w:rPrDefault>
       <w:rPr>
@@ -7854,7 +7724,7 @@
       </w:pPr>
     </w:pPrDefault>
   </w:docDefaults>
-  <w:latentStyles w:defLockedState="0" w:defUIPriority="99" w:defSemiHidden="0" w:defUnhideWhenUsed="0" w:defQFormat="0" w:count="371">
+  <w:latentStyles w:defLockedState="0" w:defUIPriority="99" w:defSemiHidden="0" w:defUnhideWhenUsed="0" w:defQFormat="0" w:count="376">
     <w:lsdException w:name="Normal" w:uiPriority="0" w:qFormat="1"/>
     <w:lsdException w:name="heading 1" w:uiPriority="9" w:qFormat="1"/>
     <w:lsdException w:name="heading 2" w:semiHidden="1" w:uiPriority="9" w:unhideWhenUsed="1" w:qFormat="1"/>
@@ -7960,7 +7830,6 @@
     <w:lsdException w:name="HTML Sample" w:semiHidden="1" w:unhideWhenUsed="1"/>
     <w:lsdException w:name="HTML Typewriter" w:semiHidden="1" w:unhideWhenUsed="1"/>
     <w:lsdException w:name="HTML Variable" w:semiHidden="1" w:unhideWhenUsed="1"/>
-    <w:lsdException w:name="Normal Table" w:semiHidden="1" w:unhideWhenUsed="1"/>
     <w:lsdException w:name="annotation subject" w:semiHidden="1" w:unhideWhenUsed="1"/>
     <w:lsdException w:name="No List" w:semiHidden="1" w:unhideWhenUsed="1"/>
     <w:lsdException w:name="Outline List 1" w:semiHidden="1" w:unhideWhenUsed="1"/>
@@ -8003,11 +7872,8 @@
     <w:lsdException w:name="Table Contemporary" w:semiHidden="1" w:unhideWhenUsed="1"/>
     <w:lsdException w:name="Table Elegant" w:semiHidden="1" w:unhideWhenUsed="1"/>
     <w:lsdException w:name="Table Professional" w:semiHidden="1" w:unhideWhenUsed="1"/>
-    <w:lsdException w:name="Table Subtle 1" w:semiHidden="1" w:unhideWhenUsed="1"/>
     <w:lsdException w:name="Table Subtle 2" w:semiHidden="1" w:unhideWhenUsed="1"/>
     <w:lsdException w:name="Table Web 1" w:semiHidden="1" w:unhideWhenUsed="1"/>
-    <w:lsdException w:name="Table Web 2" w:semiHidden="1" w:unhideWhenUsed="1"/>
-    <w:lsdException w:name="Table Web 3" w:semiHidden="1" w:unhideWhenUsed="1"/>
     <w:lsdException w:name="Balloon Text" w:semiHidden="1" w:unhideWhenUsed="1"/>
     <w:lsdException w:name="Table Grid" w:uiPriority="39"/>
     <w:lsdException w:name="Table Theme" w:semiHidden="1" w:unhideWhenUsed="1"/>
@@ -8226,6 +8092,11 @@
     <w:lsdException w:name="List Table 5 Dark Accent 6" w:uiPriority="50"/>
     <w:lsdException w:name="List Table 6 Colorful Accent 6" w:uiPriority="51"/>
     <w:lsdException w:name="List Table 7 Colorful Accent 6" w:uiPriority="52"/>
+    <w:lsdException w:name="Mention" w:semiHidden="1" w:unhideWhenUsed="1"/>
+    <w:lsdException w:name="Smart Hyperlink" w:semiHidden="1" w:unhideWhenUsed="1"/>
+    <w:lsdException w:name="Hashtag" w:semiHidden="1" w:unhideWhenUsed="1"/>
+    <w:lsdException w:name="Unresolved Mention" w:semiHidden="1" w:unhideWhenUsed="1"/>
+    <w:lsdException w:name="Smart Link" w:semiHidden="1" w:unhideWhenUsed="1"/>
   </w:latentStyles>
   <w:style w:type="paragraph" w:default="1" w:styleId="Normal">
     <w:name w:val="Normal"/>

</xml_diff>